<commit_message>
Added job and application pages
</commit_message>
<xml_diff>
--- a/ReportTemplateSample.docx
+++ b/ReportTemplateSample.docx
@@ -49,7 +49,7 @@
           </w:tcPr>
           <w:p>
             <w:r>
-              <w:t>xxxxxxx</w:t>
+              <w:t>B00161706</w:t>
             </w:r>
           </w:p>
         </w:tc>
@@ -71,7 +71,7 @@
           </w:tcPr>
           <w:p>
             <w:r>
-              <w:t>John Doe</w:t>
+              <w:t>Alexander Chiper</w:t>
             </w:r>
           </w:p>
         </w:tc>
@@ -197,7 +197,13 @@
     </w:p>
     <w:p>
       <w:r>
-        <w:t>☐ I confirm that I have read and understood the University’s Academic Integrity Policy.</w:t>
+        <w:rPr>
+          <w:rFonts w:ascii="Segoe UI Symbol" w:hAnsi="Segoe UI Symbol" w:cs="Segoe UI Symbol"/>
+        </w:rPr>
+        <w:t>☑</w:t>
+      </w:r>
+      <w:r>
+        <w:t xml:space="preserve"> I confirm that I have read and understood the University’s Academic Integrity Policy.</w:t>
       </w:r>
     </w:p>
     <w:p>
@@ -212,7 +218,13 @@
     </w:p>
     <w:p>
       <w:r>
-        <w:t>☐ I have completed the TU Dublin AI Driving License theory test.</w:t>
+        <w:rPr>
+          <w:rFonts w:ascii="Segoe UI Symbol" w:hAnsi="Segoe UI Symbol" w:cs="Segoe UI Symbol"/>
+        </w:rPr>
+        <w:t>☑</w:t>
+      </w:r>
+      <w:r>
+        <w:t xml:space="preserve"> I have completed the TU Dublin AI Driving License theory test.</w:t>
       </w:r>
     </w:p>
     <w:p>
@@ -227,23 +239,41 @@
     </w:p>
     <w:p>
       <w:r>
-        <w:t>☐ I declare that this assessment submission is my own work.</w:t>
+        <w:rPr>
+          <w:rFonts w:ascii="Segoe UI Symbol" w:hAnsi="Segoe UI Symbol" w:cs="Segoe UI Symbol"/>
+        </w:rPr>
+        <w:t>☑</w:t>
+      </w:r>
+      <w:r>
+        <w:t xml:space="preserve"> I declare that this assessment submission is my own work.</w:t>
       </w:r>
     </w:p>
     <w:p>
       <w:r>
-        <w:t>☐ I confirm that I have read and understood the AI traffic light system used as part of this assessment brief and I have adhered to the level of AI usage allowed for this assessment.</w:t>
+        <w:rPr>
+          <w:rFonts w:ascii="Segoe UI Symbol" w:hAnsi="Segoe UI Symbol" w:cs="Segoe UI Symbol"/>
+        </w:rPr>
+        <w:t>☑</w:t>
+      </w:r>
+      <w:r>
+        <w:t xml:space="preserve"> I confirm that I have read and understood the AI traffic light system used as part of this assessment brief and I have adhered to the level of AI usage allowed for this assessment.</w:t>
       </w:r>
     </w:p>
     <w:p>
       <w:r>
         <w:br/>
-        <w:t>Student Signature: ________________________</w:t>
+        <w:t xml:space="preserve">Student Signature: </w:t>
+      </w:r>
+      <w:r>
+        <w:t>Alexander Chiper</w:t>
       </w:r>
     </w:p>
     <w:p>
       <w:r>
-        <w:t>Date: ________________________</w:t>
+        <w:t>Date:</w:t>
+      </w:r>
+      <w:r>
+        <w:t>4/18/2026</w:t>
       </w:r>
     </w:p>
     <w:p/>
@@ -292,8 +322,8 @@
           <w:rFonts w:ascii="Arial" w:hAnsi="Arial" w:cs="Arial"/>
           <w:b/>
           <w:bCs/>
-          <w:sz w:val="44"/>
-          <w:szCs w:val="44"/>
+          <w:sz w:val="40"/>
+          <w:szCs w:val="40"/>
         </w:rPr>
       </w:pPr>
       <w:r>
@@ -301,10 +331,92 @@
           <w:rFonts w:ascii="Arial" w:hAnsi="Arial" w:cs="Arial"/>
           <w:b/>
           <w:bCs/>
-          <w:sz w:val="44"/>
-          <w:szCs w:val="44"/>
+          <w:sz w:val="40"/>
+          <w:szCs w:val="40"/>
         </w:rPr>
-        <w:t>[Your theme – Your Use Case]</w:t>
+        <w:t>[</w:t>
+      </w:r>
+      <w:r>
+        <w:rPr>
+          <w:rFonts w:ascii="Arial" w:hAnsi="Arial" w:cs="Arial"/>
+          <w:b/>
+          <w:bCs/>
+          <w:sz w:val="40"/>
+          <w:szCs w:val="40"/>
+        </w:rPr>
+        <w:t>Agriculture</w:t>
+      </w:r>
+      <w:r>
+        <w:rPr>
+          <w:rFonts w:ascii="Arial" w:hAnsi="Arial" w:cs="Arial"/>
+          <w:b/>
+          <w:bCs/>
+          <w:sz w:val="40"/>
+          <w:szCs w:val="40"/>
+        </w:rPr>
+        <w:t xml:space="preserve"> – </w:t>
+      </w:r>
+      <w:r>
+        <w:rPr>
+          <w:rFonts w:ascii="Arial" w:hAnsi="Arial" w:cs="Arial"/>
+          <w:b/>
+          <w:bCs/>
+          <w:sz w:val="40"/>
+          <w:szCs w:val="40"/>
+        </w:rPr>
+        <w:t>Recruiting Candidate</w:t>
+      </w:r>
+      <w:r>
+        <w:rPr>
+          <w:rFonts w:ascii="Arial" w:hAnsi="Arial" w:cs="Arial"/>
+          <w:b/>
+          <w:bCs/>
+          <w:sz w:val="40"/>
+          <w:szCs w:val="40"/>
+        </w:rPr>
+        <w:t>-</w:t>
+      </w:r>
+      <w:r>
+        <w:rPr>
+          <w:rFonts w:ascii="Arial" w:hAnsi="Arial" w:cs="Arial"/>
+          <w:b/>
+          <w:bCs/>
+          <w:sz w:val="40"/>
+          <w:szCs w:val="40"/>
+        </w:rPr>
+        <w:t>Skills</w:t>
+      </w:r>
+      <w:r>
+        <w:rPr>
+          <w:rFonts w:ascii="Arial" w:hAnsi="Arial" w:cs="Arial"/>
+          <w:b/>
+          <w:bCs/>
+          <w:sz w:val="40"/>
+          <w:szCs w:val="40"/>
+        </w:rPr>
+        <w:t>]</w:t>
+      </w:r>
+    </w:p>
+    <w:p>
+      <w:pPr>
+        <w:jc w:val="center"/>
+        <w:rPr>
+          <w:rFonts w:ascii="Arial" w:hAnsi="Arial" w:cs="Arial"/>
+          <w:b/>
+          <w:bCs/>
+          <w:sz w:val="40"/>
+          <w:szCs w:val="40"/>
+        </w:rPr>
+      </w:pPr>
+      <w:r>
+        <w:rPr>
+          <w:rFonts w:ascii="Arial" w:hAnsi="Arial" w:cs="Arial"/>
+          <w:b/>
+          <w:bCs/>
+          <w:sz w:val="40"/>
+          <w:szCs w:val="40"/>
+        </w:rPr>
+        <w:t>AgriHiredCulture</w:t>
       </w:r>
     </w:p>
     <w:p>
@@ -382,7 +494,28 @@
           <w:szCs w:val="36"/>
           <w:highlight w:val="yellow"/>
         </w:rPr>
-        <w:t>Name, Student number</w:t>
+        <w:t>Alexander Chiper</w:t>
+      </w:r>
+      <w:r>
+        <w:rPr>
+          <w:rFonts w:ascii="Arial" w:hAnsi="Arial" w:cs="Arial"/>
+          <w:b/>
+          <w:bCs/>
+          <w:sz w:val="36"/>
+          <w:szCs w:val="36"/>
+          <w:highlight w:val="yellow"/>
+        </w:rPr>
+        <w:t xml:space="preserve">, </w:t>
+      </w:r>
+      <w:r>
+        <w:rPr>
+          <w:rFonts w:ascii="Arial" w:hAnsi="Arial" w:cs="Arial"/>
+          <w:b/>
+          <w:bCs/>
+          <w:sz w:val="36"/>
+          <w:szCs w:val="36"/>
+        </w:rPr>
+        <w:t>B00161706</w:t>
       </w:r>
     </w:p>
     <w:p>
@@ -475,7 +608,6 @@
         <w:jc w:val="both"/>
       </w:pPr>
       <w:r>
-        <w:lastRenderedPageBreak/>
         <w:t xml:space="preserve">Table of Contents . . . </w:t>
       </w:r>
     </w:p>
@@ -498,43 +630,13 @@
         <w:jc w:val="both"/>
         <w:rPr>
           <w:rFonts w:cs="Arial"/>
-          <w:color w:val="FF0000"/>
         </w:rPr>
       </w:pPr>
       <w:r>
         <w:rPr>
           <w:rFonts w:cs="Arial"/>
-          <w:color w:val="FF0000"/>
         </w:rPr>
-        <w:t xml:space="preserve">Give a brief background to the </w:t>
-      </w:r>
-      <w:r>
-        <w:rPr>
-          <w:rFonts w:cs="Arial"/>
-          <w:color w:val="FF0000"/>
-        </w:rPr>
-        <w:t xml:space="preserve">business </w:t>
-      </w:r>
-      <w:r>
-        <w:rPr>
-          <w:rFonts w:cs="Arial"/>
-          <w:color w:val="FF0000"/>
-        </w:rPr>
-        <w:t>objectives</w:t>
-      </w:r>
-      <w:r>
-        <w:rPr>
-          <w:rFonts w:cs="Arial"/>
-          <w:color w:val="FF0000"/>
-        </w:rPr>
-        <w:t xml:space="preserve"> of your web framework</w:t>
-      </w:r>
-      <w:r>
-        <w:rPr>
-          <w:rFonts w:cs="Arial"/>
-          <w:color w:val="FF0000"/>
-        </w:rPr>
-        <w:t>.</w:t>
+        <w:t>AgriHiredCulture is a web recruitment application made for the agricultural sector. The application connects employers and businesses to employees that have relevant agricultural skills</w:t>
       </w:r>
     </w:p>
     <w:p>
@@ -551,58 +653,124 @@
       </w:r>
     </w:p>
     <w:p>
-      <w:pPr>
-        <w:spacing w:after="120"/>
-        <w:jc w:val="both"/>
-      </w:pPr>
       <w:r>
-        <w:rPr>
-          <w:rFonts w:ascii="Arial" w:hAnsi="Arial" w:cs="Arial"/>
-          <w:color w:val="FF0000"/>
-        </w:rPr>
-        <w:t>S</w:t>
+        <w:t>The application must have:</w:t>
       </w:r>
+    </w:p>
+    <w:p>
+      <w:pPr>
+        <w:pStyle w:val="ListParagraph"/>
+        <w:numPr>
+          <w:ilvl w:val="0"/>
+          <w:numId w:val="15"/>
+        </w:numPr>
+      </w:pPr>
       <w:r>
-        <w:rPr>
-          <w:color w:val="FF0000"/>
-        </w:rPr>
-        <w:t xml:space="preserve">tate what </w:t>
+        <w:t>Provide a system for agricultural job recruitment</w:t>
       </w:r>
+    </w:p>
+    <w:p>
+      <w:pPr>
+        <w:pStyle w:val="ListParagraph"/>
+        <w:numPr>
+          <w:ilvl w:val="0"/>
+          <w:numId w:val="15"/>
+        </w:numPr>
+      </w:pPr>
       <w:r>
-        <w:rPr>
-          <w:color w:val="FF0000"/>
-        </w:rPr>
-        <w:t>requirements are necessary for this project</w:t>
+        <w:t>Allow candidates to create profiles and manage their skills</w:t>
       </w:r>
+    </w:p>
+    <w:p>
+      <w:pPr>
+        <w:pStyle w:val="ListParagraph"/>
+        <w:numPr>
+          <w:ilvl w:val="0"/>
+          <w:numId w:val="15"/>
+        </w:numPr>
+      </w:pPr>
       <w:r>
-        <w:rPr>
-          <w:color w:val="FF0000"/>
-        </w:rPr>
-        <w:t xml:space="preserve"> from a business point of view </w:t>
+        <w:t xml:space="preserve">Employers can manage job postings </w:t>
       </w:r>
+    </w:p>
+    <w:p>
+      <w:pPr>
+        <w:pStyle w:val="ListParagraph"/>
+        <w:numPr>
+          <w:ilvl w:val="0"/>
+          <w:numId w:val="15"/>
+        </w:numPr>
+      </w:pPr>
       <w:r>
-        <w:rPr>
-          <w:rFonts w:cs="Arial"/>
-          <w:color w:val="000000" w:themeColor="text1"/>
-        </w:rPr>
-        <w:t>(</w:t>
+        <w:t>Allow employers to search for employees based on their skills</w:t>
       </w:r>
+    </w:p>
+    <w:p>
+      <w:pPr>
+        <w:pStyle w:val="ListParagraph"/>
+        <w:numPr>
+          <w:ilvl w:val="0"/>
+          <w:numId w:val="15"/>
+        </w:numPr>
+      </w:pPr>
       <w:r>
-        <w:rPr>
-          <w:rFonts w:cs="Arial"/>
-          <w:color w:val="FF0000"/>
-        </w:rPr>
-        <w:t>you can use bullet points</w:t>
+        <w:t>Support job application functionality</w:t>
       </w:r>
+    </w:p>
+    <w:p>
+      <w:pPr>
+        <w:pStyle w:val="ListParagraph"/>
+        <w:numPr>
+          <w:ilvl w:val="0"/>
+          <w:numId w:val="15"/>
+        </w:numPr>
+      </w:pPr>
       <w:r>
-        <w:rPr>
-          <w:rFonts w:cs="Arial"/>
-          <w:color w:val="000000" w:themeColor="text1"/>
-        </w:rPr>
-        <w:t>).</w:t>
+        <w:t>Be role supported (Employee/Candidate, Employer, Recruiter and Admin)</w:t>
       </w:r>
+    </w:p>
+    <w:p>
+      <w:pPr>
+        <w:pStyle w:val="ListParagraph"/>
+        <w:numPr>
+          <w:ilvl w:val="0"/>
+          <w:numId w:val="15"/>
+        </w:numPr>
+      </w:pPr>
       <w:r>
-        <w:t xml:space="preserve"> </w:t>
+        <w:t>Have secure login and Registration</w:t>
+      </w:r>
+    </w:p>
+    <w:p>
+      <w:pPr>
+        <w:pStyle w:val="ListParagraph"/>
+        <w:numPr>
+          <w:ilvl w:val="0"/>
+          <w:numId w:val="15"/>
+        </w:numPr>
+      </w:pPr>
+      <w:r>
+        <w:t>Store and manage data efficiently using a relational database</w:t>
+      </w:r>
+    </w:p>
+    <w:p>
+      <w:pPr>
+        <w:pStyle w:val="ListParagraph"/>
+        <w:numPr>
+          <w:ilvl w:val="0"/>
+          <w:numId w:val="15"/>
+        </w:numPr>
+      </w:pPr>
+      <w:r>
+        <w:t xml:space="preserve">Have a </w:t>
+      </w:r>
+      <w:proofErr w:type="gramStart"/>
+      <w:r>
+        <w:t>user friendly</w:t>
+      </w:r>
+      <w:proofErr w:type="gramEnd"/>
+      <w:r>
+        <w:t xml:space="preserve"> interface</w:t>
       </w:r>
     </w:p>
     <w:p>
@@ -865,6 +1033,7 @@
           <w:rFonts w:cstheme="majorHAnsi"/>
           <w:color w:val="FF0000"/>
         </w:rPr>
+        <w:lastRenderedPageBreak/>
         <w:t xml:space="preserve">T </w:t>
       </w:r>
       <w:r>
@@ -1140,6 +1309,9 @@
       <w:jc w:val="right"/>
     </w:pPr>
     <w:r>
+      <w:rPr>
+        <w:noProof/>
+      </w:rPr>
       <w:drawing>
         <wp:inline distT="0" distB="0" distL="0" distR="0" wp14:anchorId="667734FC" wp14:editId="06389851">
           <wp:extent cx="1524000" cy="952500"/>
@@ -1778,6 +1950,119 @@
     </w:lvl>
   </w:abstractNum>
   <w:abstractNum w:abstractNumId="13" w15:restartNumberingAfterBreak="0">
+    <w:nsid w:val="54B62298"/>
+    <w:multiLevelType w:val="hybridMultilevel"/>
+    <w:tmpl w:val="A288B5EC"/>
+    <w:lvl w:ilvl="0" w:tplc="18090001">
+      <w:start w:val="1"/>
+      <w:numFmt w:val="bullet"/>
+      <w:lvlText w:val=""/>
+      <w:lvlJc w:val="left"/>
+      <w:pPr>
+        <w:ind w:left="720" w:hanging="360"/>
+      </w:pPr>
+      <w:rPr>
+        <w:rFonts w:ascii="Symbol" w:hAnsi="Symbol" w:hint="default"/>
+      </w:rPr>
+    </w:lvl>
+    <w:lvl w:ilvl="1" w:tplc="18090003" w:tentative="1">
+      <w:start w:val="1"/>
+      <w:numFmt w:val="bullet"/>
+      <w:lvlText w:val="o"/>
+      <w:lvlJc w:val="left"/>
+      <w:pPr>
+        <w:ind w:left="1440" w:hanging="360"/>
+      </w:pPr>
+      <w:rPr>
+        <w:rFonts w:ascii="Courier New" w:hAnsi="Courier New" w:cs="Courier New" w:hint="default"/>
+      </w:rPr>
+    </w:lvl>
+    <w:lvl w:ilvl="2" w:tplc="18090005" w:tentative="1">
+      <w:start w:val="1"/>
+      <w:numFmt w:val="bullet"/>
+      <w:lvlText w:val=""/>
+      <w:lvlJc w:val="left"/>
+      <w:pPr>
+        <w:ind w:left="2160" w:hanging="360"/>
+      </w:pPr>
+      <w:rPr>
+        <w:rFonts w:ascii="Wingdings" w:hAnsi="Wingdings" w:hint="default"/>
+      </w:rPr>
+    </w:lvl>
+    <w:lvl w:ilvl="3" w:tplc="18090001" w:tentative="1">
+      <w:start w:val="1"/>
+      <w:numFmt w:val="bullet"/>
+      <w:lvlText w:val=""/>
+      <w:lvlJc w:val="left"/>
+      <w:pPr>
+        <w:ind w:left="2880" w:hanging="360"/>
+      </w:pPr>
+      <w:rPr>
+        <w:rFonts w:ascii="Symbol" w:hAnsi="Symbol" w:hint="default"/>
+      </w:rPr>
+    </w:lvl>
+    <w:lvl w:ilvl="4" w:tplc="18090003" w:tentative="1">
+      <w:start w:val="1"/>
+      <w:numFmt w:val="bullet"/>
+      <w:lvlText w:val="o"/>
+      <w:lvlJc w:val="left"/>
+      <w:pPr>
+        <w:ind w:left="3600" w:hanging="360"/>
+      </w:pPr>
+      <w:rPr>
+        <w:rFonts w:ascii="Courier New" w:hAnsi="Courier New" w:cs="Courier New" w:hint="default"/>
+      </w:rPr>
+    </w:lvl>
+    <w:lvl w:ilvl="5" w:tplc="18090005" w:tentative="1">
+      <w:start w:val="1"/>
+      <w:numFmt w:val="bullet"/>
+      <w:lvlText w:val=""/>
+      <w:lvlJc w:val="left"/>
+      <w:pPr>
+        <w:ind w:left="4320" w:hanging="360"/>
+      </w:pPr>
+      <w:rPr>
+        <w:rFonts w:ascii="Wingdings" w:hAnsi="Wingdings" w:hint="default"/>
+      </w:rPr>
+    </w:lvl>
+    <w:lvl w:ilvl="6" w:tplc="18090001" w:tentative="1">
+      <w:start w:val="1"/>
+      <w:numFmt w:val="bullet"/>
+      <w:lvlText w:val=""/>
+      <w:lvlJc w:val="left"/>
+      <w:pPr>
+        <w:ind w:left="5040" w:hanging="360"/>
+      </w:pPr>
+      <w:rPr>
+        <w:rFonts w:ascii="Symbol" w:hAnsi="Symbol" w:hint="default"/>
+      </w:rPr>
+    </w:lvl>
+    <w:lvl w:ilvl="7" w:tplc="18090003" w:tentative="1">
+      <w:start w:val="1"/>
+      <w:numFmt w:val="bullet"/>
+      <w:lvlText w:val="o"/>
+      <w:lvlJc w:val="left"/>
+      <w:pPr>
+        <w:ind w:left="5760" w:hanging="360"/>
+      </w:pPr>
+      <w:rPr>
+        <w:rFonts w:ascii="Courier New" w:hAnsi="Courier New" w:cs="Courier New" w:hint="default"/>
+      </w:rPr>
+    </w:lvl>
+    <w:lvl w:ilvl="8" w:tplc="18090005" w:tentative="1">
+      <w:start w:val="1"/>
+      <w:numFmt w:val="bullet"/>
+      <w:lvlText w:val=""/>
+      <w:lvlJc w:val="left"/>
+      <w:pPr>
+        <w:ind w:left="6480" w:hanging="360"/>
+      </w:pPr>
+      <w:rPr>
+        <w:rFonts w:ascii="Wingdings" w:hAnsi="Wingdings" w:hint="default"/>
+      </w:rPr>
+    </w:lvl>
+  </w:abstractNum>
+  <w:abstractNum w:abstractNumId="14" w15:restartNumberingAfterBreak="0">
     <w:nsid w:val="77A95487"/>
     <w:multiLevelType w:val="hybridMultilevel"/>
     <w:tmpl w:val="DC7C2012"/>
@@ -1920,7 +2205,7 @@
     <w:abstractNumId w:val="9"/>
   </w:num>
   <w:num w:numId="11" w16cid:durableId="816722100">
-    <w:abstractNumId w:val="13"/>
+    <w:abstractNumId w:val="14"/>
   </w:num>
   <w:num w:numId="12" w16cid:durableId="1432701337">
     <w:abstractNumId w:val="11"/>
@@ -1930,6 +2215,9 @@
   </w:num>
   <w:num w:numId="14" w16cid:durableId="1425881051">
     <w:abstractNumId w:val="10"/>
+  </w:num>
+  <w:num w:numId="15" w16cid:durableId="1181159847">
+    <w:abstractNumId w:val="13"/>
   </w:num>
 </w:numbering>
 </file>
@@ -2540,7 +2828,6 @@
   <w:style w:type="character" w:default="1" w:styleId="DefaultParagraphFont">
     <w:name w:val="Default Paragraph Font"/>
     <w:uiPriority w:val="1"/>
-    <w:semiHidden/>
     <w:unhideWhenUsed/>
   </w:style>
   <w:style w:type="table" w:default="1" w:styleId="TableNormal">

</xml_diff>

<commit_message>
Added info on application page
</commit_message>
<xml_diff>
--- a/ReportTemplateSample.docx
+++ b/ReportTemplateSample.docx
@@ -653,6 +653,9 @@
       </w:r>
     </w:p>
     <w:p>
+      <w:pPr>
+        <w:spacing w:line="240" w:lineRule="auto"/>
+      </w:pPr>
       <w:r>
         <w:t>The application must have:</w:t>
       </w:r>
@@ -664,6 +667,7 @@
           <w:ilvl w:val="0"/>
           <w:numId w:val="15"/>
         </w:numPr>
+        <w:spacing w:line="240" w:lineRule="auto"/>
       </w:pPr>
       <w:r>
         <w:t>Provide a system for agricultural job recruitment</w:t>
@@ -676,6 +680,7 @@
           <w:ilvl w:val="0"/>
           <w:numId w:val="15"/>
         </w:numPr>
+        <w:spacing w:line="240" w:lineRule="auto"/>
       </w:pPr>
       <w:r>
         <w:t>Allow candidates to create profiles and manage their skills</w:t>
@@ -688,6 +693,7 @@
           <w:ilvl w:val="0"/>
           <w:numId w:val="15"/>
         </w:numPr>
+        <w:spacing w:line="240" w:lineRule="auto"/>
       </w:pPr>
       <w:r>
         <w:t xml:space="preserve">Employers can manage job postings </w:t>
@@ -700,6 +706,7 @@
           <w:ilvl w:val="0"/>
           <w:numId w:val="15"/>
         </w:numPr>
+        <w:spacing w:line="240" w:lineRule="auto"/>
       </w:pPr>
       <w:r>
         <w:t>Allow employers to search for employees based on their skills</w:t>
@@ -712,6 +719,7 @@
           <w:ilvl w:val="0"/>
           <w:numId w:val="15"/>
         </w:numPr>
+        <w:spacing w:line="240" w:lineRule="auto"/>
       </w:pPr>
       <w:r>
         <w:t>Support job application functionality</w:t>
@@ -724,6 +732,7 @@
           <w:ilvl w:val="0"/>
           <w:numId w:val="15"/>
         </w:numPr>
+        <w:spacing w:line="240" w:lineRule="auto"/>
       </w:pPr>
       <w:r>
         <w:t>Be role supported (Employee/Candidate, Employer, Recruiter and Admin)</w:t>
@@ -736,6 +745,7 @@
           <w:ilvl w:val="0"/>
           <w:numId w:val="15"/>
         </w:numPr>
+        <w:spacing w:line="240" w:lineRule="auto"/>
       </w:pPr>
       <w:r>
         <w:t>Have secure login and Registration</w:t>
@@ -748,6 +758,7 @@
           <w:ilvl w:val="0"/>
           <w:numId w:val="15"/>
         </w:numPr>
+        <w:spacing w:line="240" w:lineRule="auto"/>
       </w:pPr>
       <w:r>
         <w:t>Store and manage data efficiently using a relational database</w:t>
@@ -760,17 +771,10 @@
           <w:ilvl w:val="0"/>
           <w:numId w:val="15"/>
         </w:numPr>
+        <w:spacing w:line="240" w:lineRule="auto"/>
       </w:pPr>
       <w:r>
-        <w:t xml:space="preserve">Have a </w:t>
-      </w:r>
-      <w:proofErr w:type="gramStart"/>
-      <w:r>
-        <w:t>user friendly</w:t>
-      </w:r>
-      <w:proofErr w:type="gramEnd"/>
-      <w:r>
-        <w:t xml:space="preserve"> interface</w:t>
+        <w:t>Have a user friendly interface</w:t>
       </w:r>
     </w:p>
     <w:p>
@@ -791,86 +795,290 @@
       </w:r>
     </w:p>
     <w:p>
-      <w:pPr>
-        <w:spacing w:after="0" w:line="240" w:lineRule="auto"/>
-        <w:jc w:val="both"/>
-        <w:rPr>
-          <w:color w:val="FF0000"/>
-        </w:rPr>
-      </w:pPr>
       <w:r>
         <w:rPr>
           <w:color w:val="FF0000"/>
         </w:rPr>
-        <w:t xml:space="preserve">Draw </w:t>
+        <w:drawing>
+          <wp:anchor distT="0" distB="0" distL="114300" distR="114300" simplePos="0" relativeHeight="251661312" behindDoc="0" locked="0" layoutInCell="1" allowOverlap="1" wp14:anchorId="1A7F2053" wp14:editId="405CAEFA">
+            <wp:simplePos x="0" y="0"/>
+            <wp:positionH relativeFrom="column">
+              <wp:posOffset>0</wp:posOffset>
+            </wp:positionH>
+            <wp:positionV relativeFrom="paragraph">
+              <wp:posOffset>13335</wp:posOffset>
+            </wp:positionV>
+            <wp:extent cx="2124075" cy="3347720"/>
+            <wp:effectExtent l="0" t="0" r="9525" b="5080"/>
+            <wp:wrapSquare wrapText="bothSides"/>
+            <wp:docPr id="237203814" name="Picture 1"/>
+            <wp:cNvGraphicFramePr>
+              <a:graphicFrameLocks xmlns:a="http://schemas.openxmlformats.org/drawingml/2006/main" noChangeAspect="1"/>
+            </wp:cNvGraphicFramePr>
+            <a:graphic xmlns:a="http://schemas.openxmlformats.org/drawingml/2006/main">
+              <a:graphicData uri="http://schemas.openxmlformats.org/drawingml/2006/picture">
+                <pic:pic xmlns:pic="http://schemas.openxmlformats.org/drawingml/2006/picture">
+                  <pic:nvPicPr>
+                    <pic:cNvPr id="237203814" name=""/>
+                    <pic:cNvPicPr/>
+                  </pic:nvPicPr>
+                  <pic:blipFill>
+                    <a:blip r:embed="rId10"/>
+                    <a:stretch>
+                      <a:fillRect/>
+                    </a:stretch>
+                  </pic:blipFill>
+                  <pic:spPr>
+                    <a:xfrm>
+                      <a:off x="0" y="0"/>
+                      <a:ext cx="2124075" cy="3347720"/>
+                    </a:xfrm>
+                    <a:prstGeom prst="rect">
+                      <a:avLst/>
+                    </a:prstGeom>
+                  </pic:spPr>
+                </pic:pic>
+              </a:graphicData>
+            </a:graphic>
+            <wp14:sizeRelH relativeFrom="margin">
+              <wp14:pctWidth>0</wp14:pctWidth>
+            </wp14:sizeRelH>
+            <wp14:sizeRelV relativeFrom="margin">
+              <wp14:pctHeight>0</wp14:pctHeight>
+            </wp14:sizeRelV>
+          </wp:anchor>
+        </w:drawing>
+      </w:r>
+    </w:p>
+    <w:p/>
+    <w:p/>
+    <w:p/>
+    <w:p/>
+    <w:p/>
+    <w:p/>
+    <w:p/>
+    <w:p/>
+    <w:p>
+      <w:pPr>
+        <w:rPr>
+          <w:b/>
+          <w:bCs/>
+          <w:color w:val="1F497D" w:themeColor="text2"/>
+          <w:sz w:val="24"/>
+          <w:szCs w:val="24"/>
+        </w:rPr>
+      </w:pPr>
+      <w:r>
+        <w:rPr>
+          <w:b/>
+          <w:bCs/>
+          <w:color w:val="1F497D" w:themeColor="text2"/>
+          <w:sz w:val="24"/>
+          <w:szCs w:val="24"/>
+        </w:rPr>
+        <w:lastRenderedPageBreak/>
+        <w:t>Login/Logout</w:t>
+      </w:r>
+    </w:p>
+    <w:p>
+      <w:r>
+        <w:t>Guest</w:t>
       </w:r>
       <w:r>
-        <w:rPr>
-          <w:color w:val="FF0000"/>
-        </w:rPr>
-        <w:t>U</w:t>
+        <w:t xml:space="preserve"> initiates it</w:t>
       </w:r>
       <w:r>
-        <w:rPr>
-          <w:color w:val="FF0000"/>
-        </w:rPr>
-        <w:t xml:space="preserve">se </w:t>
+        <w:t>.</w:t>
       </w:r>
       <w:r>
-        <w:rPr>
-          <w:color w:val="FF0000"/>
-        </w:rPr>
-        <w:t>C</w:t>
-      </w:r>
-      <w:r>
-        <w:rPr>
-          <w:color w:val="FF0000"/>
-        </w:rPr>
-        <w:t xml:space="preserve">ase </w:t>
-      </w:r>
-      <w:r>
-        <w:rPr>
-          <w:color w:val="FF0000"/>
-        </w:rPr>
-        <w:t>D</w:t>
-      </w:r>
-      <w:r>
-        <w:rPr>
-          <w:color w:val="FF0000"/>
-        </w:rPr>
-        <w:t>iagrams for</w:t>
-      </w:r>
-      <w:r>
-        <w:rPr>
-          <w:color w:val="FF0000"/>
-        </w:rPr>
-        <w:t xml:space="preserve"> all the use cases implemented in your project. For </w:t>
-      </w:r>
-      <w:r>
-        <w:rPr>
-          <w:color w:val="FF0000"/>
-        </w:rPr>
-        <w:t>each</w:t>
-      </w:r>
-      <w:r>
-        <w:rPr>
-          <w:color w:val="FF0000"/>
-        </w:rPr>
         <w:t xml:space="preserve"> </w:t>
       </w:r>
       <w:r>
-        <w:rPr>
-          <w:color w:val="FF0000"/>
-        </w:rPr>
-        <w:t xml:space="preserve">use </w:t>
+        <w:t xml:space="preserve">Allows new users to </w:t>
       </w:r>
       <w:r>
-        <w:rPr>
-          <w:color w:val="FF0000"/>
-        </w:rPr>
-        <w:t xml:space="preserve">case, give some explanation. </w:t>
+        <w:t>get access to their</w:t>
+      </w:r>
+      <w:r>
+        <w:t xml:space="preserve"> account in the system. This is the entry point fo</w:t>
+      </w:r>
+      <w:r>
+        <w:t xml:space="preserve">r </w:t>
+      </w:r>
+      <w:r>
+        <w:t xml:space="preserve">Candidate, Employer, </w:t>
+      </w:r>
+      <w:r>
+        <w:t>etc.</w:t>
       </w:r>
     </w:p>
+    <w:p>
+      <w:pPr>
+        <w:rPr>
+          <w:b/>
+          <w:bCs/>
+          <w:color w:val="1F497D" w:themeColor="text2"/>
+          <w:sz w:val="24"/>
+          <w:szCs w:val="24"/>
+        </w:rPr>
+      </w:pPr>
+      <w:r>
+        <w:rPr>
+          <w:b/>
+          <w:bCs/>
+          <w:color w:val="1F497D" w:themeColor="text2"/>
+          <w:sz w:val="24"/>
+          <w:szCs w:val="24"/>
+        </w:rPr>
+        <w:t>Register Account</w:t>
+      </w:r>
+    </w:p>
+    <w:p>
+      <w:r>
+        <w:t>Registration is</w:t>
+      </w:r>
+      <w:r>
+        <w:t xml:space="preserve"> performed by the Guest </w:t>
+      </w:r>
+      <w:r>
+        <w:t>it creates an account; you can register as a candidate, recruiter or Employer the boss, you have access to the sections provided.</w:t>
+      </w:r>
+    </w:p>
+    <w:p>
+      <w:pPr>
+        <w:rPr>
+          <w:b/>
+          <w:bCs/>
+          <w:color w:val="1F497D" w:themeColor="text2"/>
+          <w:sz w:val="24"/>
+          <w:szCs w:val="24"/>
+        </w:rPr>
+      </w:pPr>
+      <w:r>
+        <w:rPr>
+          <w:b/>
+          <w:bCs/>
+          <w:color w:val="1F497D" w:themeColor="text2"/>
+          <w:sz w:val="24"/>
+          <w:szCs w:val="24"/>
+        </w:rPr>
+        <w:t xml:space="preserve">Add Skills </w:t>
+      </w:r>
+    </w:p>
+    <w:p>
+      <w:r>
+        <w:t>Add skills is performed by the candidate</w:t>
+      </w:r>
+      <w:r>
+        <w:t>, candidates can choose which skills they have form list of skills to strengthen their profile, this information helps them land jobs</w:t>
+      </w:r>
+    </w:p>
+    <w:p>
+      <w:pPr>
+        <w:rPr>
+          <w:b/>
+          <w:bCs/>
+          <w:color w:val="1F497D" w:themeColor="text2"/>
+          <w:sz w:val="24"/>
+          <w:szCs w:val="24"/>
+        </w:rPr>
+      </w:pPr>
+      <w:r>
+        <w:rPr>
+          <w:b/>
+          <w:bCs/>
+          <w:color w:val="1F497D" w:themeColor="text2"/>
+          <w:sz w:val="24"/>
+          <w:szCs w:val="24"/>
+        </w:rPr>
+        <w:t xml:space="preserve">Post Job </w:t>
+      </w:r>
+    </w:p>
+    <w:p>
+      <w:r>
+        <w:t xml:space="preserve">Posting Jobs is carried out by the </w:t>
+      </w:r>
+      <w:r>
+        <w:t xml:space="preserve">Employer. Employers create job listings </w:t>
+      </w:r>
+      <w:r>
+        <w:t xml:space="preserve">the </w:t>
+      </w:r>
+      <w:r>
+        <w:t>requirements</w:t>
+      </w:r>
+      <w:r>
+        <w:t xml:space="preserve"> needed for the job</w:t>
+      </w:r>
+    </w:p>
+    <w:p>
+      <w:pPr>
+        <w:rPr>
+          <w:b/>
+          <w:bCs/>
+          <w:color w:val="1F497D" w:themeColor="text2"/>
+          <w:sz w:val="24"/>
+          <w:szCs w:val="24"/>
+        </w:rPr>
+      </w:pPr>
+      <w:r>
+        <w:rPr>
+          <w:b/>
+          <w:bCs/>
+          <w:color w:val="1F497D" w:themeColor="text2"/>
+          <w:sz w:val="24"/>
+          <w:szCs w:val="24"/>
+        </w:rPr>
+        <w:t xml:space="preserve">Apply to Job </w:t>
+      </w:r>
+    </w:p>
+    <w:p>
+      <w:r>
+        <w:t>Applying for jobs is done by the</w:t>
+      </w:r>
+      <w:r>
+        <w:t xml:space="preserve"> Candidate. Candidates submit applications to jobs posted by employers.</w:t>
+      </w:r>
+    </w:p>
+    <w:p>
+      <w:pPr>
+        <w:rPr>
+          <w:b/>
+          <w:bCs/>
+          <w:color w:val="1F497D" w:themeColor="text2"/>
+          <w:sz w:val="24"/>
+          <w:szCs w:val="24"/>
+        </w:rPr>
+      </w:pPr>
+      <w:r>
+        <w:rPr>
+          <w:b/>
+          <w:bCs/>
+          <w:color w:val="1F497D" w:themeColor="text2"/>
+          <w:sz w:val="24"/>
+          <w:szCs w:val="24"/>
+        </w:rPr>
+        <w:t>Update Application Status</w:t>
+      </w:r>
+    </w:p>
+    <w:p>
+      <w:r>
+        <w:t xml:space="preserve">Shared by Employer, Recruiter, and Admin. Allows these </w:t>
+      </w:r>
+      <w:r>
+        <w:t>users to a</w:t>
+      </w:r>
+      <w:r>
+        <w:t xml:space="preserve">ccept applications </w:t>
+      </w:r>
+      <w:r>
+        <w:t>and decline applications</w:t>
+      </w:r>
+      <w:r>
+        <w:t>.</w:t>
+      </w:r>
+    </w:p>
+    <w:p/>
     <w:p>
       <w:pPr>
         <w:pStyle w:val="Heading1"/>
@@ -1033,7 +1241,6 @@
           <w:rFonts w:cstheme="majorHAnsi"/>
           <w:color w:val="FF0000"/>
         </w:rPr>
-        <w:lastRenderedPageBreak/>
         <w:t xml:space="preserve">T </w:t>
       </w:r>
       <w:r>
@@ -1065,6 +1272,7 @@
           <w:rFonts w:cstheme="majorHAnsi"/>
           <w:color w:val="FF0000"/>
         </w:rPr>
+        <w:lastRenderedPageBreak/>
         <w:t>The model layer must align with the database design above.</w:t>
       </w:r>
     </w:p>
@@ -1241,7 +1449,7 @@
       </w:r>
     </w:p>
     <w:sectPr>
-      <w:headerReference w:type="default" r:id="rId10"/>
+      <w:headerReference w:type="default" r:id="rId11"/>
       <w:pgSz w:w="12240" w:h="15840"/>
       <w:pgMar w:top="1440" w:right="1800" w:bottom="1440" w:left="1800" w:header="720" w:footer="720" w:gutter="0"/>
       <w:cols w:space="720"/>
@@ -1837,6 +2045,155 @@
     </w:lvl>
   </w:abstractNum>
   <w:abstractNum w:abstractNumId="12" w15:restartNumberingAfterBreak="0">
+    <w:nsid w:val="39694280"/>
+    <w:multiLevelType w:val="multilevel"/>
+    <w:tmpl w:val="DED2CF54"/>
+    <w:lvl w:ilvl="0">
+      <w:start w:val="1"/>
+      <w:numFmt w:val="bullet"/>
+      <w:lvlText w:val=""/>
+      <w:lvlJc w:val="left"/>
+      <w:pPr>
+        <w:tabs>
+          <w:tab w:val="num" w:pos="720"/>
+        </w:tabs>
+        <w:ind w:left="720" w:hanging="360"/>
+      </w:pPr>
+      <w:rPr>
+        <w:rFonts w:ascii="Symbol" w:hAnsi="Symbol" w:hint="default"/>
+        <w:sz w:val="20"/>
+      </w:rPr>
+    </w:lvl>
+    <w:lvl w:ilvl="1" w:tentative="1">
+      <w:start w:val="1"/>
+      <w:numFmt w:val="bullet"/>
+      <w:lvlText w:val="o"/>
+      <w:lvlJc w:val="left"/>
+      <w:pPr>
+        <w:tabs>
+          <w:tab w:val="num" w:pos="1440"/>
+        </w:tabs>
+        <w:ind w:left="1440" w:hanging="360"/>
+      </w:pPr>
+      <w:rPr>
+        <w:rFonts w:ascii="Courier New" w:hAnsi="Courier New" w:hint="default"/>
+        <w:sz w:val="20"/>
+      </w:rPr>
+    </w:lvl>
+    <w:lvl w:ilvl="2" w:tentative="1">
+      <w:start w:val="1"/>
+      <w:numFmt w:val="bullet"/>
+      <w:lvlText w:val=""/>
+      <w:lvlJc w:val="left"/>
+      <w:pPr>
+        <w:tabs>
+          <w:tab w:val="num" w:pos="2160"/>
+        </w:tabs>
+        <w:ind w:left="2160" w:hanging="360"/>
+      </w:pPr>
+      <w:rPr>
+        <w:rFonts w:ascii="Wingdings" w:hAnsi="Wingdings" w:hint="default"/>
+        <w:sz w:val="20"/>
+      </w:rPr>
+    </w:lvl>
+    <w:lvl w:ilvl="3" w:tentative="1">
+      <w:start w:val="1"/>
+      <w:numFmt w:val="bullet"/>
+      <w:lvlText w:val=""/>
+      <w:lvlJc w:val="left"/>
+      <w:pPr>
+        <w:tabs>
+          <w:tab w:val="num" w:pos="2880"/>
+        </w:tabs>
+        <w:ind w:left="2880" w:hanging="360"/>
+      </w:pPr>
+      <w:rPr>
+        <w:rFonts w:ascii="Wingdings" w:hAnsi="Wingdings" w:hint="default"/>
+        <w:sz w:val="20"/>
+      </w:rPr>
+    </w:lvl>
+    <w:lvl w:ilvl="4" w:tentative="1">
+      <w:start w:val="1"/>
+      <w:numFmt w:val="bullet"/>
+      <w:lvlText w:val=""/>
+      <w:lvlJc w:val="left"/>
+      <w:pPr>
+        <w:tabs>
+          <w:tab w:val="num" w:pos="3600"/>
+        </w:tabs>
+        <w:ind w:left="3600" w:hanging="360"/>
+      </w:pPr>
+      <w:rPr>
+        <w:rFonts w:ascii="Wingdings" w:hAnsi="Wingdings" w:hint="default"/>
+        <w:sz w:val="20"/>
+      </w:rPr>
+    </w:lvl>
+    <w:lvl w:ilvl="5" w:tentative="1">
+      <w:start w:val="1"/>
+      <w:numFmt w:val="bullet"/>
+      <w:lvlText w:val=""/>
+      <w:lvlJc w:val="left"/>
+      <w:pPr>
+        <w:tabs>
+          <w:tab w:val="num" w:pos="4320"/>
+        </w:tabs>
+        <w:ind w:left="4320" w:hanging="360"/>
+      </w:pPr>
+      <w:rPr>
+        <w:rFonts w:ascii="Wingdings" w:hAnsi="Wingdings" w:hint="default"/>
+        <w:sz w:val="20"/>
+      </w:rPr>
+    </w:lvl>
+    <w:lvl w:ilvl="6" w:tentative="1">
+      <w:start w:val="1"/>
+      <w:numFmt w:val="bullet"/>
+      <w:lvlText w:val=""/>
+      <w:lvlJc w:val="left"/>
+      <w:pPr>
+        <w:tabs>
+          <w:tab w:val="num" w:pos="5040"/>
+        </w:tabs>
+        <w:ind w:left="5040" w:hanging="360"/>
+      </w:pPr>
+      <w:rPr>
+        <w:rFonts w:ascii="Wingdings" w:hAnsi="Wingdings" w:hint="default"/>
+        <w:sz w:val="20"/>
+      </w:rPr>
+    </w:lvl>
+    <w:lvl w:ilvl="7" w:tentative="1">
+      <w:start w:val="1"/>
+      <w:numFmt w:val="bullet"/>
+      <w:lvlText w:val=""/>
+      <w:lvlJc w:val="left"/>
+      <w:pPr>
+        <w:tabs>
+          <w:tab w:val="num" w:pos="5760"/>
+        </w:tabs>
+        <w:ind w:left="5760" w:hanging="360"/>
+      </w:pPr>
+      <w:rPr>
+        <w:rFonts w:ascii="Wingdings" w:hAnsi="Wingdings" w:hint="default"/>
+        <w:sz w:val="20"/>
+      </w:rPr>
+    </w:lvl>
+    <w:lvl w:ilvl="8" w:tentative="1">
+      <w:start w:val="1"/>
+      <w:numFmt w:val="bullet"/>
+      <w:lvlText w:val=""/>
+      <w:lvlJc w:val="left"/>
+      <w:pPr>
+        <w:tabs>
+          <w:tab w:val="num" w:pos="6480"/>
+        </w:tabs>
+        <w:ind w:left="6480" w:hanging="360"/>
+      </w:pPr>
+      <w:rPr>
+        <w:rFonts w:ascii="Wingdings" w:hAnsi="Wingdings" w:hint="default"/>
+        <w:sz w:val="20"/>
+      </w:rPr>
+    </w:lvl>
+  </w:abstractNum>
+  <w:abstractNum w:abstractNumId="13" w15:restartNumberingAfterBreak="0">
     <w:nsid w:val="3B1D0B83"/>
     <w:multiLevelType w:val="hybridMultilevel"/>
     <w:tmpl w:val="A6628DDE"/>
@@ -1949,7 +2306,305 @@
       </w:rPr>
     </w:lvl>
   </w:abstractNum>
-  <w:abstractNum w:abstractNumId="13" w15:restartNumberingAfterBreak="0">
+  <w:abstractNum w:abstractNumId="14" w15:restartNumberingAfterBreak="0">
+    <w:nsid w:val="48360ACB"/>
+    <w:multiLevelType w:val="multilevel"/>
+    <w:tmpl w:val="9C32BA32"/>
+    <w:lvl w:ilvl="0">
+      <w:start w:val="1"/>
+      <w:numFmt w:val="bullet"/>
+      <w:lvlText w:val=""/>
+      <w:lvlJc w:val="left"/>
+      <w:pPr>
+        <w:tabs>
+          <w:tab w:val="num" w:pos="720"/>
+        </w:tabs>
+        <w:ind w:left="720" w:hanging="360"/>
+      </w:pPr>
+      <w:rPr>
+        <w:rFonts w:ascii="Symbol" w:hAnsi="Symbol" w:hint="default"/>
+        <w:sz w:val="20"/>
+      </w:rPr>
+    </w:lvl>
+    <w:lvl w:ilvl="1" w:tentative="1">
+      <w:start w:val="1"/>
+      <w:numFmt w:val="bullet"/>
+      <w:lvlText w:val="o"/>
+      <w:lvlJc w:val="left"/>
+      <w:pPr>
+        <w:tabs>
+          <w:tab w:val="num" w:pos="1440"/>
+        </w:tabs>
+        <w:ind w:left="1440" w:hanging="360"/>
+      </w:pPr>
+      <w:rPr>
+        <w:rFonts w:ascii="Courier New" w:hAnsi="Courier New" w:hint="default"/>
+        <w:sz w:val="20"/>
+      </w:rPr>
+    </w:lvl>
+    <w:lvl w:ilvl="2" w:tentative="1">
+      <w:start w:val="1"/>
+      <w:numFmt w:val="bullet"/>
+      <w:lvlText w:val=""/>
+      <w:lvlJc w:val="left"/>
+      <w:pPr>
+        <w:tabs>
+          <w:tab w:val="num" w:pos="2160"/>
+        </w:tabs>
+        <w:ind w:left="2160" w:hanging="360"/>
+      </w:pPr>
+      <w:rPr>
+        <w:rFonts w:ascii="Wingdings" w:hAnsi="Wingdings" w:hint="default"/>
+        <w:sz w:val="20"/>
+      </w:rPr>
+    </w:lvl>
+    <w:lvl w:ilvl="3" w:tentative="1">
+      <w:start w:val="1"/>
+      <w:numFmt w:val="bullet"/>
+      <w:lvlText w:val=""/>
+      <w:lvlJc w:val="left"/>
+      <w:pPr>
+        <w:tabs>
+          <w:tab w:val="num" w:pos="2880"/>
+        </w:tabs>
+        <w:ind w:left="2880" w:hanging="360"/>
+      </w:pPr>
+      <w:rPr>
+        <w:rFonts w:ascii="Wingdings" w:hAnsi="Wingdings" w:hint="default"/>
+        <w:sz w:val="20"/>
+      </w:rPr>
+    </w:lvl>
+    <w:lvl w:ilvl="4" w:tentative="1">
+      <w:start w:val="1"/>
+      <w:numFmt w:val="bullet"/>
+      <w:lvlText w:val=""/>
+      <w:lvlJc w:val="left"/>
+      <w:pPr>
+        <w:tabs>
+          <w:tab w:val="num" w:pos="3600"/>
+        </w:tabs>
+        <w:ind w:left="3600" w:hanging="360"/>
+      </w:pPr>
+      <w:rPr>
+        <w:rFonts w:ascii="Wingdings" w:hAnsi="Wingdings" w:hint="default"/>
+        <w:sz w:val="20"/>
+      </w:rPr>
+    </w:lvl>
+    <w:lvl w:ilvl="5" w:tentative="1">
+      <w:start w:val="1"/>
+      <w:numFmt w:val="bullet"/>
+      <w:lvlText w:val=""/>
+      <w:lvlJc w:val="left"/>
+      <w:pPr>
+        <w:tabs>
+          <w:tab w:val="num" w:pos="4320"/>
+        </w:tabs>
+        <w:ind w:left="4320" w:hanging="360"/>
+      </w:pPr>
+      <w:rPr>
+        <w:rFonts w:ascii="Wingdings" w:hAnsi="Wingdings" w:hint="default"/>
+        <w:sz w:val="20"/>
+      </w:rPr>
+    </w:lvl>
+    <w:lvl w:ilvl="6" w:tentative="1">
+      <w:start w:val="1"/>
+      <w:numFmt w:val="bullet"/>
+      <w:lvlText w:val=""/>
+      <w:lvlJc w:val="left"/>
+      <w:pPr>
+        <w:tabs>
+          <w:tab w:val="num" w:pos="5040"/>
+        </w:tabs>
+        <w:ind w:left="5040" w:hanging="360"/>
+      </w:pPr>
+      <w:rPr>
+        <w:rFonts w:ascii="Wingdings" w:hAnsi="Wingdings" w:hint="default"/>
+        <w:sz w:val="20"/>
+      </w:rPr>
+    </w:lvl>
+    <w:lvl w:ilvl="7" w:tentative="1">
+      <w:start w:val="1"/>
+      <w:numFmt w:val="bullet"/>
+      <w:lvlText w:val=""/>
+      <w:lvlJc w:val="left"/>
+      <w:pPr>
+        <w:tabs>
+          <w:tab w:val="num" w:pos="5760"/>
+        </w:tabs>
+        <w:ind w:left="5760" w:hanging="360"/>
+      </w:pPr>
+      <w:rPr>
+        <w:rFonts w:ascii="Wingdings" w:hAnsi="Wingdings" w:hint="default"/>
+        <w:sz w:val="20"/>
+      </w:rPr>
+    </w:lvl>
+    <w:lvl w:ilvl="8" w:tentative="1">
+      <w:start w:val="1"/>
+      <w:numFmt w:val="bullet"/>
+      <w:lvlText w:val=""/>
+      <w:lvlJc w:val="left"/>
+      <w:pPr>
+        <w:tabs>
+          <w:tab w:val="num" w:pos="6480"/>
+        </w:tabs>
+        <w:ind w:left="6480" w:hanging="360"/>
+      </w:pPr>
+      <w:rPr>
+        <w:rFonts w:ascii="Wingdings" w:hAnsi="Wingdings" w:hint="default"/>
+        <w:sz w:val="20"/>
+      </w:rPr>
+    </w:lvl>
+  </w:abstractNum>
+  <w:abstractNum w:abstractNumId="15" w15:restartNumberingAfterBreak="0">
+    <w:nsid w:val="48ED79BE"/>
+    <w:multiLevelType w:val="multilevel"/>
+    <w:tmpl w:val="97BC9E8C"/>
+    <w:lvl w:ilvl="0">
+      <w:start w:val="1"/>
+      <w:numFmt w:val="bullet"/>
+      <w:lvlText w:val=""/>
+      <w:lvlJc w:val="left"/>
+      <w:pPr>
+        <w:tabs>
+          <w:tab w:val="num" w:pos="720"/>
+        </w:tabs>
+        <w:ind w:left="720" w:hanging="360"/>
+      </w:pPr>
+      <w:rPr>
+        <w:rFonts w:ascii="Symbol" w:hAnsi="Symbol" w:hint="default"/>
+        <w:sz w:val="20"/>
+      </w:rPr>
+    </w:lvl>
+    <w:lvl w:ilvl="1" w:tentative="1">
+      <w:start w:val="1"/>
+      <w:numFmt w:val="bullet"/>
+      <w:lvlText w:val="o"/>
+      <w:lvlJc w:val="left"/>
+      <w:pPr>
+        <w:tabs>
+          <w:tab w:val="num" w:pos="1440"/>
+        </w:tabs>
+        <w:ind w:left="1440" w:hanging="360"/>
+      </w:pPr>
+      <w:rPr>
+        <w:rFonts w:ascii="Courier New" w:hAnsi="Courier New" w:hint="default"/>
+        <w:sz w:val="20"/>
+      </w:rPr>
+    </w:lvl>
+    <w:lvl w:ilvl="2" w:tentative="1">
+      <w:start w:val="1"/>
+      <w:numFmt w:val="bullet"/>
+      <w:lvlText w:val=""/>
+      <w:lvlJc w:val="left"/>
+      <w:pPr>
+        <w:tabs>
+          <w:tab w:val="num" w:pos="2160"/>
+        </w:tabs>
+        <w:ind w:left="2160" w:hanging="360"/>
+      </w:pPr>
+      <w:rPr>
+        <w:rFonts w:ascii="Wingdings" w:hAnsi="Wingdings" w:hint="default"/>
+        <w:sz w:val="20"/>
+      </w:rPr>
+    </w:lvl>
+    <w:lvl w:ilvl="3" w:tentative="1">
+      <w:start w:val="1"/>
+      <w:numFmt w:val="bullet"/>
+      <w:lvlText w:val=""/>
+      <w:lvlJc w:val="left"/>
+      <w:pPr>
+        <w:tabs>
+          <w:tab w:val="num" w:pos="2880"/>
+        </w:tabs>
+        <w:ind w:left="2880" w:hanging="360"/>
+      </w:pPr>
+      <w:rPr>
+        <w:rFonts w:ascii="Wingdings" w:hAnsi="Wingdings" w:hint="default"/>
+        <w:sz w:val="20"/>
+      </w:rPr>
+    </w:lvl>
+    <w:lvl w:ilvl="4" w:tentative="1">
+      <w:start w:val="1"/>
+      <w:numFmt w:val="bullet"/>
+      <w:lvlText w:val=""/>
+      <w:lvlJc w:val="left"/>
+      <w:pPr>
+        <w:tabs>
+          <w:tab w:val="num" w:pos="3600"/>
+        </w:tabs>
+        <w:ind w:left="3600" w:hanging="360"/>
+      </w:pPr>
+      <w:rPr>
+        <w:rFonts w:ascii="Wingdings" w:hAnsi="Wingdings" w:hint="default"/>
+        <w:sz w:val="20"/>
+      </w:rPr>
+    </w:lvl>
+    <w:lvl w:ilvl="5" w:tentative="1">
+      <w:start w:val="1"/>
+      <w:numFmt w:val="bullet"/>
+      <w:lvlText w:val=""/>
+      <w:lvlJc w:val="left"/>
+      <w:pPr>
+        <w:tabs>
+          <w:tab w:val="num" w:pos="4320"/>
+        </w:tabs>
+        <w:ind w:left="4320" w:hanging="360"/>
+      </w:pPr>
+      <w:rPr>
+        <w:rFonts w:ascii="Wingdings" w:hAnsi="Wingdings" w:hint="default"/>
+        <w:sz w:val="20"/>
+      </w:rPr>
+    </w:lvl>
+    <w:lvl w:ilvl="6" w:tentative="1">
+      <w:start w:val="1"/>
+      <w:numFmt w:val="bullet"/>
+      <w:lvlText w:val=""/>
+      <w:lvlJc w:val="left"/>
+      <w:pPr>
+        <w:tabs>
+          <w:tab w:val="num" w:pos="5040"/>
+        </w:tabs>
+        <w:ind w:left="5040" w:hanging="360"/>
+      </w:pPr>
+      <w:rPr>
+        <w:rFonts w:ascii="Wingdings" w:hAnsi="Wingdings" w:hint="default"/>
+        <w:sz w:val="20"/>
+      </w:rPr>
+    </w:lvl>
+    <w:lvl w:ilvl="7" w:tentative="1">
+      <w:start w:val="1"/>
+      <w:numFmt w:val="bullet"/>
+      <w:lvlText w:val=""/>
+      <w:lvlJc w:val="left"/>
+      <w:pPr>
+        <w:tabs>
+          <w:tab w:val="num" w:pos="5760"/>
+        </w:tabs>
+        <w:ind w:left="5760" w:hanging="360"/>
+      </w:pPr>
+      <w:rPr>
+        <w:rFonts w:ascii="Wingdings" w:hAnsi="Wingdings" w:hint="default"/>
+        <w:sz w:val="20"/>
+      </w:rPr>
+    </w:lvl>
+    <w:lvl w:ilvl="8" w:tentative="1">
+      <w:start w:val="1"/>
+      <w:numFmt w:val="bullet"/>
+      <w:lvlText w:val=""/>
+      <w:lvlJc w:val="left"/>
+      <w:pPr>
+        <w:tabs>
+          <w:tab w:val="num" w:pos="6480"/>
+        </w:tabs>
+        <w:ind w:left="6480" w:hanging="360"/>
+      </w:pPr>
+      <w:rPr>
+        <w:rFonts w:ascii="Wingdings" w:hAnsi="Wingdings" w:hint="default"/>
+        <w:sz w:val="20"/>
+      </w:rPr>
+    </w:lvl>
+  </w:abstractNum>
+  <w:abstractNum w:abstractNumId="16" w15:restartNumberingAfterBreak="0">
     <w:nsid w:val="54B62298"/>
     <w:multiLevelType w:val="hybridMultilevel"/>
     <w:tmpl w:val="A288B5EC"/>
@@ -2062,7 +2717,305 @@
       </w:rPr>
     </w:lvl>
   </w:abstractNum>
-  <w:abstractNum w:abstractNumId="14" w15:restartNumberingAfterBreak="0">
+  <w:abstractNum w:abstractNumId="17" w15:restartNumberingAfterBreak="0">
+    <w:nsid w:val="60BE1589"/>
+    <w:multiLevelType w:val="multilevel"/>
+    <w:tmpl w:val="CC3EDB6E"/>
+    <w:lvl w:ilvl="0">
+      <w:start w:val="1"/>
+      <w:numFmt w:val="bullet"/>
+      <w:lvlText w:val=""/>
+      <w:lvlJc w:val="left"/>
+      <w:pPr>
+        <w:tabs>
+          <w:tab w:val="num" w:pos="720"/>
+        </w:tabs>
+        <w:ind w:left="720" w:hanging="360"/>
+      </w:pPr>
+      <w:rPr>
+        <w:rFonts w:ascii="Symbol" w:hAnsi="Symbol" w:hint="default"/>
+        <w:sz w:val="20"/>
+      </w:rPr>
+    </w:lvl>
+    <w:lvl w:ilvl="1" w:tentative="1">
+      <w:start w:val="1"/>
+      <w:numFmt w:val="bullet"/>
+      <w:lvlText w:val="o"/>
+      <w:lvlJc w:val="left"/>
+      <w:pPr>
+        <w:tabs>
+          <w:tab w:val="num" w:pos="1440"/>
+        </w:tabs>
+        <w:ind w:left="1440" w:hanging="360"/>
+      </w:pPr>
+      <w:rPr>
+        <w:rFonts w:ascii="Courier New" w:hAnsi="Courier New" w:hint="default"/>
+        <w:sz w:val="20"/>
+      </w:rPr>
+    </w:lvl>
+    <w:lvl w:ilvl="2" w:tentative="1">
+      <w:start w:val="1"/>
+      <w:numFmt w:val="bullet"/>
+      <w:lvlText w:val=""/>
+      <w:lvlJc w:val="left"/>
+      <w:pPr>
+        <w:tabs>
+          <w:tab w:val="num" w:pos="2160"/>
+        </w:tabs>
+        <w:ind w:left="2160" w:hanging="360"/>
+      </w:pPr>
+      <w:rPr>
+        <w:rFonts w:ascii="Wingdings" w:hAnsi="Wingdings" w:hint="default"/>
+        <w:sz w:val="20"/>
+      </w:rPr>
+    </w:lvl>
+    <w:lvl w:ilvl="3" w:tentative="1">
+      <w:start w:val="1"/>
+      <w:numFmt w:val="bullet"/>
+      <w:lvlText w:val=""/>
+      <w:lvlJc w:val="left"/>
+      <w:pPr>
+        <w:tabs>
+          <w:tab w:val="num" w:pos="2880"/>
+        </w:tabs>
+        <w:ind w:left="2880" w:hanging="360"/>
+      </w:pPr>
+      <w:rPr>
+        <w:rFonts w:ascii="Wingdings" w:hAnsi="Wingdings" w:hint="default"/>
+        <w:sz w:val="20"/>
+      </w:rPr>
+    </w:lvl>
+    <w:lvl w:ilvl="4" w:tentative="1">
+      <w:start w:val="1"/>
+      <w:numFmt w:val="bullet"/>
+      <w:lvlText w:val=""/>
+      <w:lvlJc w:val="left"/>
+      <w:pPr>
+        <w:tabs>
+          <w:tab w:val="num" w:pos="3600"/>
+        </w:tabs>
+        <w:ind w:left="3600" w:hanging="360"/>
+      </w:pPr>
+      <w:rPr>
+        <w:rFonts w:ascii="Wingdings" w:hAnsi="Wingdings" w:hint="default"/>
+        <w:sz w:val="20"/>
+      </w:rPr>
+    </w:lvl>
+    <w:lvl w:ilvl="5" w:tentative="1">
+      <w:start w:val="1"/>
+      <w:numFmt w:val="bullet"/>
+      <w:lvlText w:val=""/>
+      <w:lvlJc w:val="left"/>
+      <w:pPr>
+        <w:tabs>
+          <w:tab w:val="num" w:pos="4320"/>
+        </w:tabs>
+        <w:ind w:left="4320" w:hanging="360"/>
+      </w:pPr>
+      <w:rPr>
+        <w:rFonts w:ascii="Wingdings" w:hAnsi="Wingdings" w:hint="default"/>
+        <w:sz w:val="20"/>
+      </w:rPr>
+    </w:lvl>
+    <w:lvl w:ilvl="6" w:tentative="1">
+      <w:start w:val="1"/>
+      <w:numFmt w:val="bullet"/>
+      <w:lvlText w:val=""/>
+      <w:lvlJc w:val="left"/>
+      <w:pPr>
+        <w:tabs>
+          <w:tab w:val="num" w:pos="5040"/>
+        </w:tabs>
+        <w:ind w:left="5040" w:hanging="360"/>
+      </w:pPr>
+      <w:rPr>
+        <w:rFonts w:ascii="Wingdings" w:hAnsi="Wingdings" w:hint="default"/>
+        <w:sz w:val="20"/>
+      </w:rPr>
+    </w:lvl>
+    <w:lvl w:ilvl="7" w:tentative="1">
+      <w:start w:val="1"/>
+      <w:numFmt w:val="bullet"/>
+      <w:lvlText w:val=""/>
+      <w:lvlJc w:val="left"/>
+      <w:pPr>
+        <w:tabs>
+          <w:tab w:val="num" w:pos="5760"/>
+        </w:tabs>
+        <w:ind w:left="5760" w:hanging="360"/>
+      </w:pPr>
+      <w:rPr>
+        <w:rFonts w:ascii="Wingdings" w:hAnsi="Wingdings" w:hint="default"/>
+        <w:sz w:val="20"/>
+      </w:rPr>
+    </w:lvl>
+    <w:lvl w:ilvl="8" w:tentative="1">
+      <w:start w:val="1"/>
+      <w:numFmt w:val="bullet"/>
+      <w:lvlText w:val=""/>
+      <w:lvlJc w:val="left"/>
+      <w:pPr>
+        <w:tabs>
+          <w:tab w:val="num" w:pos="6480"/>
+        </w:tabs>
+        <w:ind w:left="6480" w:hanging="360"/>
+      </w:pPr>
+      <w:rPr>
+        <w:rFonts w:ascii="Wingdings" w:hAnsi="Wingdings" w:hint="default"/>
+        <w:sz w:val="20"/>
+      </w:rPr>
+    </w:lvl>
+  </w:abstractNum>
+  <w:abstractNum w:abstractNumId="18" w15:restartNumberingAfterBreak="0">
+    <w:nsid w:val="67201274"/>
+    <w:multiLevelType w:val="multilevel"/>
+    <w:tmpl w:val="351857AC"/>
+    <w:lvl w:ilvl="0">
+      <w:start w:val="1"/>
+      <w:numFmt w:val="bullet"/>
+      <w:lvlText w:val=""/>
+      <w:lvlJc w:val="left"/>
+      <w:pPr>
+        <w:tabs>
+          <w:tab w:val="num" w:pos="720"/>
+        </w:tabs>
+        <w:ind w:left="720" w:hanging="360"/>
+      </w:pPr>
+      <w:rPr>
+        <w:rFonts w:ascii="Symbol" w:hAnsi="Symbol" w:hint="default"/>
+        <w:sz w:val="20"/>
+      </w:rPr>
+    </w:lvl>
+    <w:lvl w:ilvl="1" w:tentative="1">
+      <w:start w:val="1"/>
+      <w:numFmt w:val="bullet"/>
+      <w:lvlText w:val="o"/>
+      <w:lvlJc w:val="left"/>
+      <w:pPr>
+        <w:tabs>
+          <w:tab w:val="num" w:pos="1440"/>
+        </w:tabs>
+        <w:ind w:left="1440" w:hanging="360"/>
+      </w:pPr>
+      <w:rPr>
+        <w:rFonts w:ascii="Courier New" w:hAnsi="Courier New" w:hint="default"/>
+        <w:sz w:val="20"/>
+      </w:rPr>
+    </w:lvl>
+    <w:lvl w:ilvl="2" w:tentative="1">
+      <w:start w:val="1"/>
+      <w:numFmt w:val="bullet"/>
+      <w:lvlText w:val=""/>
+      <w:lvlJc w:val="left"/>
+      <w:pPr>
+        <w:tabs>
+          <w:tab w:val="num" w:pos="2160"/>
+        </w:tabs>
+        <w:ind w:left="2160" w:hanging="360"/>
+      </w:pPr>
+      <w:rPr>
+        <w:rFonts w:ascii="Wingdings" w:hAnsi="Wingdings" w:hint="default"/>
+        <w:sz w:val="20"/>
+      </w:rPr>
+    </w:lvl>
+    <w:lvl w:ilvl="3" w:tentative="1">
+      <w:start w:val="1"/>
+      <w:numFmt w:val="bullet"/>
+      <w:lvlText w:val=""/>
+      <w:lvlJc w:val="left"/>
+      <w:pPr>
+        <w:tabs>
+          <w:tab w:val="num" w:pos="2880"/>
+        </w:tabs>
+        <w:ind w:left="2880" w:hanging="360"/>
+      </w:pPr>
+      <w:rPr>
+        <w:rFonts w:ascii="Wingdings" w:hAnsi="Wingdings" w:hint="default"/>
+        <w:sz w:val="20"/>
+      </w:rPr>
+    </w:lvl>
+    <w:lvl w:ilvl="4" w:tentative="1">
+      <w:start w:val="1"/>
+      <w:numFmt w:val="bullet"/>
+      <w:lvlText w:val=""/>
+      <w:lvlJc w:val="left"/>
+      <w:pPr>
+        <w:tabs>
+          <w:tab w:val="num" w:pos="3600"/>
+        </w:tabs>
+        <w:ind w:left="3600" w:hanging="360"/>
+      </w:pPr>
+      <w:rPr>
+        <w:rFonts w:ascii="Wingdings" w:hAnsi="Wingdings" w:hint="default"/>
+        <w:sz w:val="20"/>
+      </w:rPr>
+    </w:lvl>
+    <w:lvl w:ilvl="5" w:tentative="1">
+      <w:start w:val="1"/>
+      <w:numFmt w:val="bullet"/>
+      <w:lvlText w:val=""/>
+      <w:lvlJc w:val="left"/>
+      <w:pPr>
+        <w:tabs>
+          <w:tab w:val="num" w:pos="4320"/>
+        </w:tabs>
+        <w:ind w:left="4320" w:hanging="360"/>
+      </w:pPr>
+      <w:rPr>
+        <w:rFonts w:ascii="Wingdings" w:hAnsi="Wingdings" w:hint="default"/>
+        <w:sz w:val="20"/>
+      </w:rPr>
+    </w:lvl>
+    <w:lvl w:ilvl="6" w:tentative="1">
+      <w:start w:val="1"/>
+      <w:numFmt w:val="bullet"/>
+      <w:lvlText w:val=""/>
+      <w:lvlJc w:val="left"/>
+      <w:pPr>
+        <w:tabs>
+          <w:tab w:val="num" w:pos="5040"/>
+        </w:tabs>
+        <w:ind w:left="5040" w:hanging="360"/>
+      </w:pPr>
+      <w:rPr>
+        <w:rFonts w:ascii="Wingdings" w:hAnsi="Wingdings" w:hint="default"/>
+        <w:sz w:val="20"/>
+      </w:rPr>
+    </w:lvl>
+    <w:lvl w:ilvl="7" w:tentative="1">
+      <w:start w:val="1"/>
+      <w:numFmt w:val="bullet"/>
+      <w:lvlText w:val=""/>
+      <w:lvlJc w:val="left"/>
+      <w:pPr>
+        <w:tabs>
+          <w:tab w:val="num" w:pos="5760"/>
+        </w:tabs>
+        <w:ind w:left="5760" w:hanging="360"/>
+      </w:pPr>
+      <w:rPr>
+        <w:rFonts w:ascii="Wingdings" w:hAnsi="Wingdings" w:hint="default"/>
+        <w:sz w:val="20"/>
+      </w:rPr>
+    </w:lvl>
+    <w:lvl w:ilvl="8" w:tentative="1">
+      <w:start w:val="1"/>
+      <w:numFmt w:val="bullet"/>
+      <w:lvlText w:val=""/>
+      <w:lvlJc w:val="left"/>
+      <w:pPr>
+        <w:tabs>
+          <w:tab w:val="num" w:pos="6480"/>
+        </w:tabs>
+        <w:ind w:left="6480" w:hanging="360"/>
+      </w:pPr>
+      <w:rPr>
+        <w:rFonts w:ascii="Wingdings" w:hAnsi="Wingdings" w:hint="default"/>
+        <w:sz w:val="20"/>
+      </w:rPr>
+    </w:lvl>
+  </w:abstractNum>
+  <w:abstractNum w:abstractNumId="19" w15:restartNumberingAfterBreak="0">
     <w:nsid w:val="77A95487"/>
     <w:multiLevelType w:val="hybridMultilevel"/>
     <w:tmpl w:val="DC7C2012"/>
@@ -2205,19 +3158,34 @@
     <w:abstractNumId w:val="9"/>
   </w:num>
   <w:num w:numId="11" w16cid:durableId="816722100">
-    <w:abstractNumId w:val="14"/>
+    <w:abstractNumId w:val="19"/>
   </w:num>
   <w:num w:numId="12" w16cid:durableId="1432701337">
     <w:abstractNumId w:val="11"/>
   </w:num>
   <w:num w:numId="13" w16cid:durableId="1542594236">
-    <w:abstractNumId w:val="12"/>
+    <w:abstractNumId w:val="13"/>
   </w:num>
   <w:num w:numId="14" w16cid:durableId="1425881051">
     <w:abstractNumId w:val="10"/>
   </w:num>
   <w:num w:numId="15" w16cid:durableId="1181159847">
-    <w:abstractNumId w:val="13"/>
+    <w:abstractNumId w:val="16"/>
+  </w:num>
+  <w:num w:numId="16" w16cid:durableId="1352337229">
+    <w:abstractNumId w:val="14"/>
+  </w:num>
+  <w:num w:numId="17" w16cid:durableId="1915316253">
+    <w:abstractNumId w:val="15"/>
+  </w:num>
+  <w:num w:numId="18" w16cid:durableId="2037121209">
+    <w:abstractNumId w:val="18"/>
+  </w:num>
+  <w:num w:numId="19" w16cid:durableId="1120952496">
+    <w:abstractNumId w:val="12"/>
+  </w:num>
+  <w:num w:numId="20" w16cid:durableId="1179734854">
+    <w:abstractNumId w:val="17"/>
   </w:num>
 </w:numbering>
 </file>

</xml_diff>